<commit_message>
Corrige el Word de la rutina para que abra en Word
Co-Authored-By: Claude Opus 5.5 <noreply@anthropic.com>
Claude-Session: https://claude.ai/code/session_015PfrwJnF2wsp656kSpm277
</commit_message>
<xml_diff>
--- a/guiones/rutina-3-dias-perder-grasa.docx
+++ b/guiones/rutina-3-dias-perder-grasa.docx
@@ -5868,23 +5868,17 @@
               <w:spacing w:after="0" w:before="0"/>
               <w:jc w:val="center"/>
             </w:pPr>
-            <w:p>
-              <w:pPr>
-                <w:spacing w:after="0" w:before="0"/>
-                <w:jc w:val="center"/>
-              </w:pPr>
-              <w:r>
-                <w:rPr>
-                  <w:rFonts w:ascii="Calibri" w:cs="Calibri" w:eastAsia="Calibri" w:hAnsi="Calibri"/>
-                  <w:b/>
-                  <w:bCs/>
-                  <w:color w:val="FF8A1F"/>
-                  <w:sz w:val="18"/>
-                  <w:szCs w:val="18"/>
-                </w:rPr>
-                <w:t xml:space="preserve"> SUBE PESO </w:t>
-              </w:r>
-            </w:p>
+            <w:r>
+              <w:rPr>
+                <w:rFonts w:ascii="Calibri" w:cs="Calibri" w:eastAsia="Calibri" w:hAnsi="Calibri"/>
+                <w:b/>
+                <w:bCs/>
+                <w:color w:val="FF8A1F"/>
+                <w:sz w:val="18"/>
+                <w:szCs w:val="18"/>
+              </w:rPr>
+              <w:t xml:space="preserve"> SUBE PESO </w:t>
+            </w:r>
           </w:p>
         </w:tc>
       </w:tr>
@@ -6086,21 +6080,15 @@
               <w:spacing w:after="0" w:before="0"/>
               <w:jc w:val="center"/>
             </w:pPr>
-            <w:p>
-              <w:pPr>
-                <w:spacing w:after="0" w:before="0"/>
-                <w:jc w:val="center"/>
-              </w:pPr>
-              <w:r>
-                <w:rPr>
-                  <w:rFonts w:ascii="Calibri" w:cs="Calibri" w:eastAsia="Calibri" w:hAnsi="Calibri"/>
-                  <w:color w:val="5B6275"/>
-                  <w:sz w:val="17"/>
-                  <w:szCs w:val="17"/>
-                </w:rPr>
-                <w:t xml:space="preserve">vuelta a empezar</w:t>
-              </w:r>
-            </w:p>
+            <w:r>
+              <w:rPr>
+                <w:rFonts w:ascii="Calibri" w:cs="Calibri" w:eastAsia="Calibri" w:hAnsi="Calibri"/>
+                <w:color w:val="5B6275"/>
+                <w:sz w:val="17"/>
+                <w:szCs w:val="17"/>
+              </w:rPr>
+              <w:t xml:space="preserve">vuelta a empezar</w:t>
+            </w:r>
           </w:p>
         </w:tc>
       </w:tr>

</xml_diff>